<commit_message>
Add sequence diagrams and embed in technical doc - Redesign personas diagram: horizontal flow, aligned captions, highlighted AgentCore Gateway components - Remove unused imports (mpatches, FancyArrowPatch, numpy) - Add helper _draw_hbox() for reusable box rendering - Create update_technical_doc.py to embed PNGs into .docx - Update AgentCore_Technical_Flow.docx with new Sequence Diagrams section including explanatory text and both diagram images
</commit_message>
<xml_diff>
--- a/docs/AgentCore_Technical_Flow.docx
+++ b/docs/AgentCore_Technical_Flow.docx
@@ -4613,6 +4613,299 @@
         <w:br w:type="page"/>
       </w:r>
     </w:p>
+    <w:p>
+      <w:r>
+        <w:br w:type="page"/>
+      </w:r>
+    </w:p>
+    <w:p>
+      <w:pPr>
+        <w:pStyle w:val="Heading1"/>
+      </w:pPr>
+      <w:r>
+        <w:t>Sequence Diagrams: Access Control Flow</w:t>
+      </w:r>
+    </w:p>
+    <w:p>
+      <w:r>
+        <w:t>The following diagrams illustrate the end-to-end access control flow implemented by AgentCore Gateway. They show how user identity (via JWT claims from Cognito) flows through the REQUEST Interceptor, gets evaluated by the Cedar Policy Engine, and determines whether an MCP tool is invoked or the request is denied — all before any data leaves the system.</w:t>
+      </w:r>
+    </w:p>
+    <w:p>
+      <w:pPr>
+        <w:pStyle w:val="Heading2"/>
+      </w:pPr>
+      <w:r>
+        <w:t>Diagram 1: End-to-End Access Control Sequence</w:t>
+      </w:r>
+    </w:p>
+    <w:p>
+      <w:r>
+        <w:t>This UML-style sequence diagram shows the complete lifecycle of a request, from user authentication through Cognito, to the agent's LLM reasoning, through the AgentCore Gateway's enrichment and authorization layers, and finally to tool execution or denial.</w:t>
+      </w:r>
+    </w:p>
+    <w:p>
+      <w:r>
+        <w:rPr>
+          <w:b/>
+        </w:rPr>
+        <w:t>Key observations:</w:t>
+      </w:r>
+    </w:p>
+    <w:p>
+      <w:pPr>
+        <w:pStyle w:val="ListBullet"/>
+      </w:pPr>
+      <w:r>
+        <w:t>Authentication: Cognito issues a JWT with custom claims (role, line_scope, plant_scope, equipment_scope) that encode the user's data boundaries.</w:t>
+      </w:r>
+    </w:p>
+    <w:p>
+      <w:pPr>
+        <w:pStyle w:val="ListBullet"/>
+      </w:pPr>
+      <w:r>
+        <w:t>Enrichment: The REQUEST Interceptor decodes the JWT and injects user_context into the tool call arguments — the agent/LLM never sees or controls this step.</w:t>
+      </w:r>
+    </w:p>
+    <w:p>
+      <w:pPr>
+        <w:pStyle w:val="ListBullet"/>
+      </w:pPr>
+      <w:r>
+        <w:t>Authorization: Cedar evaluates the enriched request against policies. A 'permit_all' baseline allows access, while 'forbid_*' rules check whether the requested parameter falls within the user's scope.</w:t>
+      </w:r>
+    </w:p>
+    <w:p>
+      <w:pPr>
+        <w:pStyle w:val="ListBullet"/>
+      </w:pPr>
+      <w:r>
+        <w:t>Execution vs Denial: If Cedar allows, the Gateway forwards to the Lambda tool target. If Cedar denies, the MCP server is NEVER invoked — zero data exposure.</w:t>
+      </w:r>
+    </w:p>
+    <w:p>
+      <w:pPr>
+        <w:pStyle w:val="ListBullet"/>
+      </w:pPr>
+      <w:r>
+        <w:t>Synthesis: The agent receives either tool results or a deny message, and composes a natural-language response. On denial, it explains the boundary and suggests alternatives within scope.</w:t>
+      </w:r>
+    </w:p>
+    <w:p>
+      <w:pPr>
+        <w:jc w:val="center"/>
+      </w:pPr>
+      <w:r>
+        <w:drawing>
+          <wp:inline xmlns:a="http://schemas.openxmlformats.org/drawingml/2006/main" xmlns:pic="http://schemas.openxmlformats.org/drawingml/2006/picture">
+            <wp:extent cx="5943600" cy="5197612"/>
+            <wp:docPr id="1" name="Picture 1"/>
+            <wp:cNvGraphicFramePr>
+              <a:graphicFrameLocks noChangeAspect="1"/>
+            </wp:cNvGraphicFramePr>
+            <a:graphic>
+              <a:graphicData uri="http://schemas.openxmlformats.org/drawingml/2006/picture">
+                <pic:pic>
+                  <pic:nvPicPr>
+                    <pic:cNvPr id="0" name="sequence_diagram_access_control.png"/>
+                    <pic:cNvPicPr/>
+                  </pic:nvPicPr>
+                  <pic:blipFill>
+                    <a:blip r:embed="rId9"/>
+                    <a:stretch>
+                      <a:fillRect/>
+                    </a:stretch>
+                  </pic:blipFill>
+                  <pic:spPr>
+                    <a:xfrm>
+                      <a:off x="0" y="0"/>
+                      <a:ext cx="5943600" cy="5197612"/>
+                    </a:xfrm>
+                    <a:prstGeom prst="rect"/>
+                  </pic:spPr>
+                </pic:pic>
+              </a:graphicData>
+            </a:graphic>
+          </wp:inline>
+        </w:drawing>
+      </w:r>
+    </w:p>
+    <w:p>
+      <w:pPr>
+        <w:jc w:val="center"/>
+      </w:pPr>
+      <w:r>
+        <w:rPr>
+          <w:i/>
+          <w:color w:val="555555"/>
+          <w:sz w:val="18"/>
+        </w:rPr>
+        <w:t>Figure 1: AgentCore Gateway — Fine-Grained Access Control Sequence Diagram</w:t>
+      </w:r>
+    </w:p>
+    <w:p>
+      <w:pPr>
+        <w:pStyle w:val="Heading2"/>
+      </w:pPr>
+      <w:r>
+        <w:t>Diagram 2: Three Personas — Same Interface, Different Access</w:t>
+      </w:r>
+    </w:p>
+    <w:p>
+      <w:r>
+        <w:t>This comparison diagram demonstrates how the same agent interface produces different outcomes for different users. Each row represents a persona with a horizontal left-to-right flow through the system components.</w:t>
+      </w:r>
+    </w:p>
+    <w:p>
+      <w:r>
+        <w:rPr>
+          <w:b/>
+        </w:rPr>
+        <w:t>Personas:</w:t>
+      </w:r>
+    </w:p>
+    <w:p>
+      <w:pPr>
+        <w:pStyle w:val="ListBullet"/>
+      </w:pPr>
+      <w:r>
+        <w:t>Sarah Chen (Plant Manager) — Full access. Queries are never denied because her role has the 'has_full_access' attribute, bypassing all forbid rules.</w:t>
+      </w:r>
+    </w:p>
+    <w:p>
+      <w:pPr>
+        <w:pStyle w:val="ListBullet"/>
+      </w:pPr>
+      <w:r>
+        <w:t>Raj Patel (Line Supervisor) — Scoped to Line 7, Plant 2. Attempts to access Line 4 data are denied at the Cedar layer. The Lambda tool is never invoked.</w:t>
+      </w:r>
+    </w:p>
+    <w:p>
+      <w:pPr>
+        <w:pStyle w:val="ListBullet"/>
+      </w:pPr>
+      <w:r>
+        <w:t>Priya Nair (Maintenance Technician) — Scoped to Machines 41-45. Attempts to access Machine 72 are denied. The agent suggests checking Machine 42 instead.</w:t>
+      </w:r>
+    </w:p>
+    <w:p>
+      <w:r>
+        <w:rPr>
+          <w:b/>
+        </w:rPr>
+        <w:t>AgentCore components highlighted:</w:t>
+      </w:r>
+    </w:p>
+    <w:p>
+      <w:r>
+        <w:t>The purple-shaded region in the diagram encloses the two AgentCore-managed components: the Gateway (with its REQUEST Interceptor) and the Cedar Policy Engine. These operate server-side, external to the agent process, ensuring that neither the LLM nor application code can bypass authorization.</w:t>
+      </w:r>
+    </w:p>
+    <w:p>
+      <w:pPr>
+        <w:jc w:val="center"/>
+      </w:pPr>
+      <w:r>
+        <w:drawing>
+          <wp:inline xmlns:a="http://schemas.openxmlformats.org/drawingml/2006/main" xmlns:pic="http://schemas.openxmlformats.org/drawingml/2006/picture">
+            <wp:extent cx="5943600" cy="3961293"/>
+            <wp:docPr id="2" name="Picture 2"/>
+            <wp:cNvGraphicFramePr>
+              <a:graphicFrameLocks noChangeAspect="1"/>
+            </wp:cNvGraphicFramePr>
+            <a:graphic>
+              <a:graphicData uri="http://schemas.openxmlformats.org/drawingml/2006/picture">
+                <pic:pic>
+                  <pic:nvPicPr>
+                    <pic:cNvPr id="0" name="sequence_diagram_personas.png"/>
+                    <pic:cNvPicPr/>
+                  </pic:nvPicPr>
+                  <pic:blipFill>
+                    <a:blip r:embed="rId10"/>
+                    <a:stretch>
+                      <a:fillRect/>
+                    </a:stretch>
+                  </pic:blipFill>
+                  <pic:spPr>
+                    <a:xfrm>
+                      <a:off x="0" y="0"/>
+                      <a:ext cx="5943600" cy="3961293"/>
+                    </a:xfrm>
+                    <a:prstGeom prst="rect"/>
+                  </pic:spPr>
+                </pic:pic>
+              </a:graphicData>
+            </a:graphic>
+          </wp:inline>
+        </w:drawing>
+      </w:r>
+    </w:p>
+    <w:p>
+      <w:pPr>
+        <w:jc w:val="center"/>
+      </w:pPr>
+      <w:r>
+        <w:rPr>
+          <w:i/>
+          <w:color w:val="555555"/>
+          <w:sz w:val="18"/>
+        </w:rPr>
+        <w:t>Figure 2: Same Agent, Same Interface — Different Data Access (AgentCore Gateway enforces Cedar policies at the parameter level)</w:t>
+      </w:r>
+    </w:p>
+    <w:p>
+      <w:pPr>
+        <w:pStyle w:val="Heading2"/>
+      </w:pPr>
+      <w:r>
+        <w:t>Key Security Properties Illustrated</w:t>
+      </w:r>
+    </w:p>
+    <w:p>
+      <w:r>
+        <w:rPr>
+          <w:b/>
+        </w:rPr>
+        <w:t xml:space="preserve">Deterministic Authorization: </w:t>
+      </w:r>
+      <w:r>
+        <w:t>Cedar evaluation is pure logic — same input always produces the same output. The LLM cannot influence the policy decision regardless of prompt injection.</w:t>
+      </w:r>
+    </w:p>
+    <w:p>
+      <w:r>
+        <w:rPr>
+          <w:b/>
+        </w:rPr>
+        <w:t xml:space="preserve">Fail-Secure: </w:t>
+      </w:r>
+      <w:r>
+        <w:t>If the interceptor crashes, no context is injected. Cedar has nothing to permit, so the result is DENY (deny-by-default).</w:t>
+      </w:r>
+    </w:p>
+    <w:p>
+      <w:r>
+        <w:rPr>
+          <w:b/>
+        </w:rPr>
+        <w:t xml:space="preserve">MCP Server Isolation: </w:t>
+      </w:r>
+      <w:r>
+        <w:t>Denied requests NEVER reach the MCP server. The tool Lambda is not invoked. No data processing occurs. No compute is wasted.</w:t>
+      </w:r>
+    </w:p>
+    <w:p>
+      <w:r>
+        <w:rPr>
+          <w:b/>
+        </w:rPr>
+        <w:t xml:space="preserve">Graceful Degradation: </w:t>
+      </w:r>
+      <w:r>
+        <w:t>The agent receives the deny message as a tool result and intelligently responds: explains what it CAN access, suggests alternatives, and does NOT retry the denied call.</w:t>
+      </w:r>
+    </w:p>
     <w:sectPr>
       <w:pgSz w:w="12240" w:h="15840"/>
       <w:pgMar w:top="1440" w:right="1800" w:bottom="1440" w:left="1800" w:header="720" w:footer="720" w:gutter="0"/>

</xml_diff>

<commit_message>
Fix: test count 63→80, component count 8→10, regenerate .docx
</commit_message>
<xml_diff>
--- a/docs/AgentCore_Technical_Flow.docx
+++ b/docs/AgentCore_Technical_Flow.docx
@@ -712,7 +712,7 @@
           <w:i w:val="0"/>
           <w:sz w:val="22"/>
         </w:rPr>
-        <w:t>Amazon Bedrock AgentCore provides eight core services that together form a complete platform for building, deploying, and securing AI agents at scale.</w:t>
+        <w:t>Amazon Bedrock AgentCore provides ten core services that together form a complete platform for building, deploying, and securing AI agents at scale.</w:t>
       </w:r>
     </w:p>
     <w:p/>
@@ -2649,7 +2649,7 @@
       <w:r>
         <w:drawing>
           <wp:inline xmlns:a="http://schemas.openxmlformats.org/drawingml/2006/main" xmlns:pic="http://schemas.openxmlformats.org/drawingml/2006/picture">
-            <wp:extent cx="5943600" cy="5517535"/>
+            <wp:extent cx="5943600" cy="4839905"/>
             <wp:docPr id="1" name="Picture 1"/>
             <wp:cNvGraphicFramePr>
               <a:graphicFrameLocks noChangeAspect="1"/>
@@ -2670,7 +2670,7 @@
                   <pic:spPr>
                     <a:xfrm>
                       <a:off x="0" y="0"/>
-                      <a:ext cx="5943600" cy="5517535"/>
+                      <a:ext cx="5943600" cy="4839905"/>
                     </a:xfrm>
                     <a:prstGeom prst="rect"/>
                   </pic:spPr>
@@ -2699,7 +2699,7 @@
       <w:r>
         <w:drawing>
           <wp:inline xmlns:a="http://schemas.openxmlformats.org/drawingml/2006/main" xmlns:pic="http://schemas.openxmlformats.org/drawingml/2006/picture">
-            <wp:extent cx="5943600" cy="4448740"/>
+            <wp:extent cx="5943600" cy="5277917"/>
             <wp:docPr id="2" name="Picture 2"/>
             <wp:cNvGraphicFramePr>
               <a:graphicFrameLocks noChangeAspect="1"/>
@@ -2720,7 +2720,7 @@
                   <pic:spPr>
                     <a:xfrm>
                       <a:off x="0" y="0"/>
-                      <a:ext cx="5943600" cy="4448740"/>
+                      <a:ext cx="5943600" cy="5277917"/>
                     </a:xfrm>
                     <a:prstGeom prst="rect"/>
                   </pic:spPr>

</xml_diff>